<commit_message>
Concordance as prose not a statistic; Zenodo DOI 10.5281/zenodo.21876444
The 12/12 and 11/12 figures are gone. 2.5 now states what happened — the
second pass reproduced every verdict, agreed on confidence, and disagreed on
one tier (rfbC, and the second reading is the better one) — and says plainly
that no agreement statistic is reported and none should be inferred.

Reason: independence could not be verified, so a proportion here would be
unearned precision of exactly the kind the paper criticises elsewhere. The
family-by-family comparison stays in results/chunk5_concordance.md for anyone
who wants to judge it.

Data availability now cites the archived Zenodo release as the version
underlying the manuscript, with GitHub named only as where development
continues. DOI also added to CITATION.cff.

Co-Authored-By: Claude Opus 5 <noreply@anthropic.com>
</commit_message>
<xml_diff>
--- a/manuscript/preprint_bioRxiv.docx
+++ b/manuscript/preprint_bioRxiv.docx
@@ -64,7 +64,17 @@
         <w:t xml:space="preserve">Data and code availability:</w:t>
       </w:r>
       <w:r>
-        <w:t xml:space="preserve"> all analysis code, intermediate results, the pre-registered protocol with amendments, the frozen accession list, the sealed abundance counts with their commit history, and both adjudication passes are openly available at https://github.com/dmurfy06/amg-annotation-audit</w:t>
+        <w:t xml:space="preserve"> all analysis code, intermediate results, the pre-registered protocol with amendments, the frozen accession list, the sealed abundance counts with their commit history, and both adjudication passes are openly available. The version underlying this manuscript is permanently archived at </w:t>
+      </w:r>
+      <w:r>
+        <w:rPr>
+          <w:b/>
+          <w:bCs/>
+        </w:rPr>
+        <w:t xml:space="preserve">doi:10.5281/zenodo.21876444</w:t>
+      </w:r>
+      <w:r>
+        <w:t xml:space="preserve">; development continues at https://github.com/dmurfy06/amg-annotation-audit</w:t>
       </w:r>
     </w:p>
     <w:p>
@@ -2691,47 +2701,77 @@
         <w:jc w:val="left"/>
       </w:pPr>
       <w:r>
+        <w:t xml:space="preserve">The second pass reproduced every verdict of the first, and agreed on confidence throughout. It disagreed on the evidence tier for one family, </w:t>
+      </w:r>
+      <w:r>
+        <w:rPr>
+          <w:rFonts w:ascii="Consolas" w:cs="Consolas" w:eastAsia="Consolas" w:hAnsi="Consolas"/>
+          <w:sz w:val="19"/>
+          <w:szCs w:val="19"/>
+        </w:rPr>
+        <w:t xml:space="preserve">rfbC</w:t>
+      </w:r>
+      <w:r>
+        <w:t xml:space="preserve">, where the first pass assigned Tier 2 on the strength of literature concerning O-antigen </w:t>
+      </w:r>
+      <w:r>
+        <w:rPr>
+          <w:i/>
+          <w:iCs/>
+        </w:rPr>
+        <w:t xml:space="preserve">transfer</w:t>
+      </w:r>
+      <w:r>
+        <w:t xml:space="preserve"> enzymes and the second assigned Tier 6, on the grounds that </w:t>
+      </w:r>
+      <w:r>
+        <w:rPr>
+          <w:rFonts w:ascii="Consolas" w:cs="Consolas" w:eastAsia="Consolas" w:hAnsi="Consolas"/>
+          <w:sz w:val="19"/>
+          <w:szCs w:val="19"/>
+        </w:rPr>
+        <w:t xml:space="preserve">rfbC</w:t>
+      </w:r>
+      <w:r>
+        <w:t xml:space="preserve"> makes a precursor rather than performing the transfer. The second reading is better, and the verdict is unchanged either way.</w:t>
+      </w:r>
+    </w:p>
+    <w:p>
+      <w:pPr>
+        <w:spacing w:after="120" w:before="60"/>
+        <w:jc w:val="left"/>
+      </w:pPr>
+      <w:r>
         <w:rPr>
           <w:b/>
           <w:bCs/>
         </w:rPr>
-        <w:t xml:space="preserve">Agreement: 12/12 verdict, 12/12 confidence, 11/12 evidence tier.</w:t>
-      </w:r>
-    </w:p>
-    <w:p>
-      <w:pPr>
-        <w:spacing w:after="120" w:before="60"/>
-        <w:jc w:val="left"/>
-      </w:pPr>
-      <w:r>
-        <w:rPr>
-          <w:b/>
-          <w:bCs/>
-        </w:rPr>
-        <w:t xml:space="preserve">Independence could not be verified.</w:t>
-      </w:r>
-      <w:r>
-        <w:t xml:space="preserve"> The first-pass file remained accessible to the second rater during rating, contrary to protocol. Text-similarity analysis does not indicate copying — every content word in the second rater's free text appears in the supplied evidence extracts, which is sufficient to explain the overlap, and the single tier disagreement is not consistent with transcription. We nonetheless report this as a </w:t>
-      </w:r>
-      <w:r>
-        <w:rPr>
-          <w:b/>
-          <w:bCs/>
-        </w:rPr>
-        <w:t xml:space="preserve">rubric-application check with independence unverified</w:t>
-      </w:r>
-      <w:r>
-        <w:t xml:space="preserve">, and </w:t>
-      </w:r>
-      <w:r>
-        <w:rPr>
-          <w:b/>
-          <w:bCs/>
-        </w:rPr>
-        <w:t xml:space="preserve">do not present κ as an inter-rater reliability statistic for this study.</w:t>
-      </w:r>
-      <w:r>
-        <w:t xml:space="preserve"> A genuine reliability figure requires a second human rater working from the blind materials alone, and we did not obtain one.</w:t>
+        <w:t xml:space="preserve">No agreement statistic is reported, and none should be inferred.</w:t>
+      </w:r>
+      <w:r>
+        <w:t xml:space="preserve"> Independence could not be verified: the first-pass file remained accessible to the second rater during rating, contrary to protocol. Text-similarity analysis does not indicate copying — every content word in the second rater's free text appears in the supplied evidence extracts, which is sufficient to explain the overlap, and the </w:t>
+      </w:r>
+      <w:r>
+        <w:rPr>
+          <w:rFonts w:ascii="Consolas" w:cs="Consolas" w:eastAsia="Consolas" w:hAnsi="Consolas"/>
+          <w:sz w:val="19"/>
+          <w:szCs w:val="19"/>
+        </w:rPr>
+        <w:t xml:space="preserve">rfbC</w:t>
+      </w:r>
+      <w:r>
+        <w:t xml:space="preserve"> disagreement is not consistent with transcription. But "probably independent" does not support a reliability coefficient, and quoting a proportion here would invite exactly the unearned precision this paper criticises elsewhere. A genuine inter-rater reliability figure requires a second human rater working from the blind materials alone, and we did not obtain one. The full comparison, family by family, is in </w:t>
+      </w:r>
+      <w:r>
+        <w:rPr>
+          <w:rFonts w:ascii="Consolas" w:cs="Consolas" w:eastAsia="Consolas" w:hAnsi="Consolas"/>
+          <w:sz w:val="19"/>
+          <w:szCs w:val="19"/>
+        </w:rPr>
+        <w:t xml:space="preserve">results/chunk5_concordance.md</w:t>
+      </w:r>
+      <w:r>
+        <w:t xml:space="preserve"> for anyone who wants to judge it themselves.</w:t>
       </w:r>
     </w:p>
     <w:p>

</xml_diff>